<commit_message>
Remove Status overview bar from all pages
Drop the collapsed status strip and four-way summary from TplA-F,
regenerate pages, and update CLAUDE.md, CHANGES.md and the screen reference.

Co-Authored-By: Claude Opus 5.5 <noreply@anthropic.com>
</commit_message>
<xml_diff>
--- a/docs/Control Tower Screen Reference.docx
+++ b/docs/Control Tower Screen Reference.docx
@@ -37,7 +37,7 @@
     <w:p>
       <w:pPr/>
       <w:r>
-        <w:t xml:space="preserve">Every page with a status strip now shows it folded into a collapsed “Status overview” bar with a one-line count (e.g. “5 areas · 1 intervention required · 2 deteriorating …”); clicking expands the strip and the four-way summary. The three home pages (O-01, G-01, E-01) group their KPI cards and charts under numbered theme sections, and KPI cards stretch to fill each row.</w:t>
+        <w:t xml:space="preserve">The Status overview bar (status strip and four-way summary) has been removed from all pages. The three home pages (O-01, G-01, E-01) group their KPI cards and charts under numbered theme sections, and KPI cards stretch to fill each row.</w:t>
       </w:r>
     </w:p>
     <w:p>
@@ -123,41 +123,6 @@
             <w:pPr/>
             <w:r>
               <w:t xml:space="preserve">Why it matters</w:t>
-            </w:r>
-          </w:p>
-        </w:tc>
-      </w:tr>
-      <w:tr>
-        <w:tc>
-          <w:tcPr>
-            <w:tcW w:w="3120" w:type="dxa"/>
-          </w:tcPr>
-          <w:p>
-            <w:pPr/>
-            <w:r>
-              <w:t xml:space="preserve">Status overview (collapsed)</w:t>
-            </w:r>
-          </w:p>
-        </w:tc>
-        <w:tc>
-          <w:tcPr>
-            <w:tcW w:w="3120" w:type="dxa"/>
-          </w:tcPr>
-          <w:p>
-            <w:pPr/>
-            <w:r>
-              <w:t xml:space="preserve">One line counting areas by status; click to expand the status strip and the four-way summary</w:t>
-            </w:r>
-          </w:p>
-        </w:tc>
-        <w:tc>
-          <w:tcPr>
-            <w:tcW w:w="3120" w:type="dxa"/>
-          </w:tcPr>
-          <w:p>
-            <w:pPr/>
-            <w:r>
-              <w:t xml:space="preserve">The one-glance verdict before anyone reads a number</w:t>
             </w:r>
           </w:p>
         </w:tc>

</xml_diff>